<commit_message>
Java report: FitTracker-style cover, signatures and index with page numbers
Co-Authored-By: Claude Opus 5.5 <noreply@anthropic.com>
Claude-Session: https://claude.ai/code/session_01DP2bf5JSdcg2G8WKtQbPFu
</commit_message>
<xml_diff>
--- a/report/Java_report.docx
+++ b/report/Java_report.docx
@@ -537,6 +537,7 @@
     <w:tbl>
       <w:tblPr>
         <w:tblW w:w="0" w:type="auto"/>
+        <w:jc w:val="center"/>
         <w:tblInd w:w="521" w:type="dxa"/>
         <w:tblBorders>
           <w:top w:val="single" w:sz="6" w:space="0" w:color="000000"/>
@@ -572,9 +573,9 @@
           <w:p>
             <w:pPr>
               <w:pStyle w:val="TableParagraph"/>
-              <w:spacing w:before="111"/>
-              <w:ind w:right="1186"/>
-              <w:jc w:val="right"/>
+              <w:spacing w:before="40" w:after="40"/>
+              <w:ind w:right="0" w:firstLine="0" w:left="0"/>
+              <w:jc w:val="center"/>
               <w:rPr>
                 <w:b/>
                 <w:sz w:val="32"/>
@@ -582,27 +583,11 @@
             </w:pPr>
             <w:r>
               <w:rPr>
+                <w:rFonts w:ascii="Times New Roman" w:hAnsi="Times New Roman" w:cs="Times New Roman" w:eastAsia="Times New Roman"/>
                 <w:b/>
-                <w:spacing w:val="-4"/>
-                <w:sz w:val="32"/>
+                <w:sz w:val="24"/>
               </w:rPr>
-              <w:t>Group</w:t>
-            </w:r>
-            <w:r>
-              <w:rPr>
-                <w:b/>
-                <w:spacing w:val="-12"/>
-                <w:sz w:val="32"/>
-              </w:rPr>
-              <w:t xml:space="preserve"> </w:t>
-            </w:r>
-            <w:r>
-              <w:rPr>
-                <w:b/>
-                <w:spacing w:val="-2"/>
-                <w:sz w:val="32"/>
-              </w:rPr>
-              <w:t>Members</w:t>
+              <w:t>Group Members</w:t>
             </w:r>
           </w:p>
         </w:tc>
@@ -617,8 +602,9 @@
           <w:p>
             <w:pPr>
               <w:pStyle w:val="TableParagraph"/>
-              <w:spacing w:before="113" w:line="256" w:lineRule="auto"/>
-              <w:ind w:left="1135" w:right="81"/>
+              <w:spacing w:before="40" w:line="256" w:lineRule="auto" w:after="40"/>
+              <w:ind w:left="0" w:right="0" w:firstLine="0"/>
+              <w:jc w:val="center"/>
               <w:rPr>
                 <w:b/>
                 <w:sz w:val="32"/>
@@ -626,9 +612,9 @@
             </w:pPr>
             <w:r>
               <w:rPr>
+                <w:rFonts w:ascii="Times New Roman" w:hAnsi="Times New Roman" w:cs="Times New Roman" w:eastAsia="Times New Roman"/>
                 <w:b/>
-                <w:spacing w:val="-4"/>
-                <w:sz w:val="32"/>
+                <w:sz w:val="24"/>
               </w:rPr>
               <w:t>Enrollment No.</w:t>
             </w:r>
@@ -651,16 +637,18 @@
           <w:p>
             <w:pPr>
               <w:pStyle w:val="TableParagraph"/>
-              <w:spacing w:before="194"/>
-              <w:ind w:right="1124"/>
-              <w:jc w:val="right"/>
+              <w:spacing w:before="40" w:after="40"/>
+              <w:ind w:right="0" w:firstLine="0" w:left="0"/>
+              <w:jc w:val="center"/>
               <w:rPr>
                 <w:sz w:val="28"/>
               </w:rPr>
             </w:pPr>
             <w:r>
               <w:rPr>
-                <w:sz w:val="28"/>
+                <w:rFonts w:ascii="Times New Roman" w:hAnsi="Times New Roman" w:cs="Times New Roman" w:eastAsia="Times New Roman"/>
+                <w:b w:val="0"/>
+                <w:sz w:val="24"/>
               </w:rPr>
               <w:t>Avinash Jambhale</w:t>
             </w:r>
@@ -678,17 +666,18 @@
           <w:p>
             <w:pPr>
               <w:pStyle w:val="TableParagraph"/>
-              <w:spacing w:before="194"/>
-              <w:ind w:right="867"/>
-              <w:jc w:val="right"/>
+              <w:spacing w:before="40" w:after="40"/>
+              <w:ind w:right="0" w:firstLine="0" w:left="0"/>
+              <w:jc w:val="center"/>
               <w:rPr>
                 <w:sz w:val="28"/>
               </w:rPr>
             </w:pPr>
             <w:r>
               <w:rPr>
-                <w:spacing w:val="-2"/>
-                <w:sz w:val="28"/>
+                <w:rFonts w:ascii="Times New Roman" w:hAnsi="Times New Roman" w:cs="Times New Roman" w:eastAsia="Times New Roman"/>
+                <w:b w:val="0"/>
+                <w:sz w:val="24"/>
               </w:rPr>
               <w:t>2406085</w:t>
             </w:r>
@@ -712,16 +701,20 @@
           <w:p>
             <w:pPr>
               <w:pStyle w:val="TableParagraph"/>
-              <w:spacing w:before="170"/>
+              <w:spacing w:before="40" w:after="40"/>
+              <w:ind w:firstLine="0" w:left="0" w:right="0"/>
+              <w:jc w:val="center"/>
               <w:rPr>
                 <w:sz w:val="28"/>
               </w:rPr>
             </w:pPr>
             <w:r>
               <w:rPr>
-                <w:sz w:val="28"/>
+                <w:rFonts w:ascii="Times New Roman" w:hAnsi="Times New Roman" w:cs="Times New Roman" w:eastAsia="Times New Roman"/>
+                <w:b w:val="0"/>
+                <w:sz w:val="24"/>
               </w:rPr>
-              <w:t xml:space="preserve">               Siddharth Lokhande</w:t>
+              <w:t>Siddharth Lokhande</w:t>
             </w:r>
           </w:p>
         </w:tc>
@@ -738,17 +731,18 @@
           <w:p>
             <w:pPr>
               <w:pStyle w:val="TableParagraph"/>
-              <w:spacing w:before="115"/>
-              <w:ind w:right="862"/>
-              <w:jc w:val="right"/>
+              <w:spacing w:before="40" w:after="40"/>
+              <w:ind w:right="0" w:firstLine="0" w:left="0"/>
+              <w:jc w:val="center"/>
               <w:rPr>
                 <w:sz w:val="28"/>
               </w:rPr>
             </w:pPr>
             <w:r>
               <w:rPr>
-                <w:spacing w:val="-2"/>
-                <w:sz w:val="28"/>
+                <w:rFonts w:ascii="Times New Roman" w:hAnsi="Times New Roman" w:cs="Times New Roman" w:eastAsia="Times New Roman"/>
+                <w:b w:val="0"/>
+                <w:sz w:val="24"/>
               </w:rPr>
               <w:t>2406119</w:t>
             </w:r>
@@ -772,19 +766,20 @@
           <w:p>
             <w:pPr>
               <w:pStyle w:val="TableParagraph"/>
-              <w:spacing w:before="168"/>
-              <w:ind w:right="1206"/>
-              <w:jc w:val="right"/>
+              <w:spacing w:before="40" w:after="40"/>
+              <w:ind w:right="0" w:firstLine="0" w:left="0"/>
+              <w:jc w:val="center"/>
               <w:rPr>
                 <w:sz w:val="28"/>
               </w:rPr>
             </w:pPr>
             <w:r>
               <w:rPr>
-                <w:spacing w:val="-2"/>
-                <w:sz w:val="28"/>
+                <w:rFonts w:ascii="Times New Roman" w:hAnsi="Times New Roman" w:cs="Times New Roman" w:eastAsia="Times New Roman"/>
+                <w:b w:val="0"/>
+                <w:sz w:val="24"/>
               </w:rPr>
-              <w:t xml:space="preserve">         Dnyaneshwar Mengal</w:t>
+              <w:t>Dnyaneshwar Mengal</w:t>
             </w:r>
           </w:p>
         </w:tc>
@@ -801,17 +796,18 @@
           <w:p>
             <w:pPr>
               <w:pStyle w:val="TableParagraph"/>
-              <w:spacing w:before="115"/>
-              <w:ind w:right="862"/>
-              <w:jc w:val="right"/>
+              <w:spacing w:before="40" w:after="40"/>
+              <w:ind w:right="0" w:firstLine="0" w:left="0"/>
+              <w:jc w:val="center"/>
               <w:rPr>
                 <w:sz w:val="28"/>
               </w:rPr>
             </w:pPr>
             <w:r>
               <w:rPr>
-                <w:spacing w:val="-2"/>
-                <w:sz w:val="28"/>
+                <w:rFonts w:ascii="Times New Roman" w:hAnsi="Times New Roman" w:cs="Times New Roman" w:eastAsia="Times New Roman"/>
+                <w:b w:val="0"/>
+                <w:sz w:val="24"/>
               </w:rPr>
               <w:t>2306117</w:t>
             </w:r>
@@ -821,7 +817,7 @@
     </w:tbl>
     <w:p>
       <w:pPr>
-        <w:spacing w:before="294"/>
+        <w:spacing w:before="360" w:after="280"/>
         <w:ind w:left="25" w:right="21"/>
         <w:jc w:val="center"/>
         <w:rPr>
@@ -832,60 +828,15 @@
       <w:r>
         <w:rPr>
           <w:rFonts w:ascii="Times New Roman" w:hAnsi="Times New Roman" w:cs="Times New Roman" w:eastAsia="Times New Roman"/>
+          <w:b/>
           <w:sz w:val="28"/>
         </w:rPr>
-        <w:t>Under</w:t>
-      </w:r>
-      <w:r>
-        <w:rPr>
-          <w:rFonts w:ascii="Times New Roman" w:hAnsi="Times New Roman" w:cs="Times New Roman" w:eastAsia="Times New Roman"/>
-          <w:spacing w:val="18"/>
-          <w:sz w:val="28"/>
-        </w:rPr>
-        <w:t xml:space="preserve"> </w:t>
-      </w:r>
-      <w:r>
-        <w:rPr>
-          <w:rFonts w:ascii="Times New Roman" w:hAnsi="Times New Roman" w:cs="Times New Roman" w:eastAsia="Times New Roman"/>
-          <w:sz w:val="28"/>
-        </w:rPr>
-        <w:t>the</w:t>
-      </w:r>
-      <w:r>
-        <w:rPr>
-          <w:rFonts w:ascii="Times New Roman" w:hAnsi="Times New Roman" w:cs="Times New Roman" w:eastAsia="Times New Roman"/>
-          <w:spacing w:val="15"/>
-          <w:sz w:val="28"/>
-        </w:rPr>
-        <w:t xml:space="preserve"> </w:t>
-      </w:r>
-      <w:r>
-        <w:rPr>
-          <w:rFonts w:ascii="Times New Roman" w:hAnsi="Times New Roman" w:cs="Times New Roman" w:eastAsia="Times New Roman"/>
-          <w:sz w:val="28"/>
-        </w:rPr>
-        <w:t>Guidance</w:t>
-      </w:r>
-      <w:r>
-        <w:rPr>
-          <w:rFonts w:ascii="Times New Roman" w:hAnsi="Times New Roman" w:cs="Times New Roman" w:eastAsia="Times New Roman"/>
-          <w:spacing w:val="12"/>
-          <w:sz w:val="28"/>
-        </w:rPr>
-        <w:t xml:space="preserve"> </w:t>
-      </w:r>
-      <w:r>
-        <w:rPr>
-          <w:rFonts w:ascii="Times New Roman" w:hAnsi="Times New Roman" w:cs="Times New Roman" w:eastAsia="Times New Roman"/>
-          <w:spacing w:val="-5"/>
-          <w:sz w:val="28"/>
-        </w:rPr>
-        <w:t>of</w:t>
-      </w:r>
-    </w:p>
-    <w:p>
-      <w:pPr>
-        <w:spacing w:before="300"/>
+        <w:t>Guided by:</w:t>
+      </w:r>
+    </w:p>
+    <w:p>
+      <w:pPr>
+        <w:spacing w:before="300" w:after="0"/>
         <w:ind w:left="25" w:right="25"/>
         <w:jc w:val="center"/>
         <w:rPr>
@@ -907,32 +858,11 @@
       </w:pPr>
       <w:r>
         <w:rPr>
+          <w:rFonts w:ascii="Times New Roman" w:hAnsi="Times New Roman" w:cs="Times New Roman" w:eastAsia="Times New Roman"/>
           <w:b/>
-          <w:sz w:val="32"/>
-        </w:rPr>
-        <w:t>Smt</w:t>
-      </w:r>
-      <w:r>
-        <w:rPr>
-          <w:b/>
-          <w:spacing w:val="63"/>
-          <w:sz w:val="32"/>
-        </w:rPr>
-        <w:t xml:space="preserve"> </w:t>
-      </w:r>
-      <w:r>
-        <w:rPr>
-          <w:b/>
-          <w:sz w:val="32"/>
-        </w:rPr>
-        <w:t xml:space="preserve">   S.B.G</w:t>
-      </w:r>
-      <w:r>
-        <w:rPr>
-          <w:b/>
-          <w:sz w:val="32"/>
-        </w:rPr>
-        <w:t>osavi</w:t>
+          <w:sz w:val="28"/>
+        </w:rPr>
+        <w:t>Smt.S.B.Gosavi</w:t>
       </w:r>
     </w:p>
     <w:p>
@@ -3618,6 +3548,7 @@
     <w:tbl>
       <w:tblPr>
         <w:tblW w:w="0" w:type="auto"/>
+        <w:jc w:val="center"/>
         <w:tblInd w:w="965" w:type="dxa"/>
         <w:tblBorders>
           <w:top w:val="single" w:sz="6" w:space="0" w:color="000000"/>
@@ -3653,9 +3584,9 @@
           <w:p>
             <w:pPr>
               <w:pStyle w:val="TableParagraph"/>
-              <w:spacing w:before="111"/>
-              <w:ind w:right="1187"/>
-              <w:jc w:val="right"/>
+              <w:spacing w:before="40" w:after="40"/>
+              <w:ind w:right="0" w:firstLine="0" w:left="0"/>
+              <w:jc w:val="center"/>
               <w:rPr>
                 <w:b/>
                 <w:sz w:val="32"/>
@@ -3663,27 +3594,11 @@
             </w:pPr>
             <w:r>
               <w:rPr>
+                <w:rFonts w:ascii="Times New Roman" w:hAnsi="Times New Roman" w:cs="Times New Roman" w:eastAsia="Times New Roman"/>
                 <w:b/>
-                <w:spacing w:val="-4"/>
-                <w:sz w:val="32"/>
+                <w:sz w:val="24"/>
               </w:rPr>
-              <w:t>Group</w:t>
-            </w:r>
-            <w:r>
-              <w:rPr>
-                <w:b/>
-                <w:spacing w:val="-12"/>
-                <w:sz w:val="32"/>
-              </w:rPr>
-              <w:t xml:space="preserve"> </w:t>
-            </w:r>
-            <w:r>
-              <w:rPr>
-                <w:b/>
-                <w:spacing w:val="-2"/>
-                <w:sz w:val="32"/>
-              </w:rPr>
-              <w:t>Members</w:t>
+              <w:t>Group Members</w:t>
             </w:r>
           </w:p>
         </w:tc>
@@ -3698,8 +3613,9 @@
           <w:p>
             <w:pPr>
               <w:pStyle w:val="TableParagraph"/>
-              <w:spacing w:before="111" w:line="259" w:lineRule="auto"/>
-              <w:ind w:left="1137" w:right="81"/>
+              <w:spacing w:before="40" w:line="259" w:lineRule="auto" w:after="40"/>
+              <w:ind w:left="0" w:right="0" w:firstLine="0"/>
+              <w:jc w:val="center"/>
               <w:rPr>
                 <w:b/>
                 <w:sz w:val="32"/>
@@ -3707,9 +3623,9 @@
             </w:pPr>
             <w:r>
               <w:rPr>
+                <w:rFonts w:ascii="Times New Roman" w:hAnsi="Times New Roman" w:cs="Times New Roman" w:eastAsia="Times New Roman"/>
                 <w:b/>
-                <w:spacing w:val="-4"/>
-                <w:sz w:val="32"/>
+                <w:sz w:val="24"/>
               </w:rPr>
               <w:t>Enrollment No.</w:t>
             </w:r>
@@ -3732,16 +3648,18 @@
           <w:p>
             <w:pPr>
               <w:pStyle w:val="TableParagraph"/>
-              <w:spacing w:before="194"/>
-              <w:ind w:right="1124"/>
-              <w:jc w:val="right"/>
+              <w:spacing w:before="40" w:after="40"/>
+              <w:ind w:right="0" w:firstLine="0" w:left="0"/>
+              <w:jc w:val="center"/>
               <w:rPr>
                 <w:sz w:val="28"/>
               </w:rPr>
             </w:pPr>
             <w:r>
               <w:rPr>
-                <w:sz w:val="28"/>
+                <w:rFonts w:ascii="Times New Roman" w:hAnsi="Times New Roman" w:cs="Times New Roman" w:eastAsia="Times New Roman"/>
+                <w:b w:val="0"/>
+                <w:sz w:val="24"/>
               </w:rPr>
               <w:t>Avinash Jambhale</w:t>
             </w:r>
@@ -3759,26 +3677,20 @@
           <w:p>
             <w:pPr>
               <w:pStyle w:val="TableParagraph"/>
-              <w:spacing w:before="192"/>
-              <w:ind w:right="865"/>
-              <w:jc w:val="right"/>
+              <w:spacing w:before="40" w:after="40"/>
+              <w:ind w:right="0" w:firstLine="0" w:left="0"/>
+              <w:jc w:val="center"/>
               <w:rPr>
                 <w:sz w:val="28"/>
               </w:rPr>
             </w:pPr>
             <w:r>
               <w:rPr>
-                <w:spacing w:val="-2"/>
-                <w:sz w:val="28"/>
+                <w:rFonts w:ascii="Times New Roman" w:hAnsi="Times New Roman" w:cs="Times New Roman" w:eastAsia="Times New Roman"/>
+                <w:b w:val="0"/>
+                <w:sz w:val="24"/>
               </w:rPr>
-              <w:t>2</w:t>
-            </w:r>
-            <w:r>
-              <w:rPr>
-                <w:spacing w:val="-2"/>
-                <w:sz w:val="28"/>
-              </w:rPr>
-              <w:t>406085</w:t>
+              <w:t>2406085</w:t>
             </w:r>
           </w:p>
         </w:tc>
@@ -3800,15 +3712,18 @@
           <w:p>
             <w:pPr>
               <w:pStyle w:val="TableParagraph"/>
-              <w:spacing w:before="170"/>
-              <w:ind w:left="1365"/>
+              <w:spacing w:before="40" w:after="40"/>
+              <w:ind w:left="0" w:firstLine="0" w:right="0"/>
+              <w:jc w:val="center"/>
               <w:rPr>
                 <w:sz w:val="28"/>
               </w:rPr>
             </w:pPr>
             <w:r>
               <w:rPr>
-                <w:sz w:val="28"/>
+                <w:rFonts w:ascii="Times New Roman" w:hAnsi="Times New Roman" w:cs="Times New Roman" w:eastAsia="Times New Roman"/>
+                <w:b w:val="0"/>
+                <w:sz w:val="24"/>
               </w:rPr>
               <w:t>Siddharth Lokhande</w:t>
             </w:r>
@@ -3827,26 +3742,20 @@
           <w:p>
             <w:pPr>
               <w:pStyle w:val="TableParagraph"/>
-              <w:spacing w:before="115"/>
-              <w:ind w:right="860"/>
-              <w:jc w:val="right"/>
+              <w:spacing w:before="40" w:after="40"/>
+              <w:ind w:right="0" w:firstLine="0" w:left="0"/>
+              <w:jc w:val="center"/>
               <w:rPr>
                 <w:sz w:val="28"/>
               </w:rPr>
             </w:pPr>
             <w:r>
               <w:rPr>
-                <w:spacing w:val="-2"/>
-                <w:sz w:val="28"/>
+                <w:rFonts w:ascii="Times New Roman" w:hAnsi="Times New Roman" w:cs="Times New Roman" w:eastAsia="Times New Roman"/>
+                <w:b w:val="0"/>
+                <w:sz w:val="24"/>
               </w:rPr>
-              <w:t>2</w:t>
-            </w:r>
-            <w:r>
-              <w:rPr>
-                <w:spacing w:val="-2"/>
-                <w:sz w:val="28"/>
-              </w:rPr>
-              <w:t>406119</w:t>
+              <w:t>2406119</w:t>
             </w:r>
           </w:p>
         </w:tc>
@@ -3868,16 +3777,18 @@
           <w:p>
             <w:pPr>
               <w:pStyle w:val="TableParagraph"/>
-              <w:spacing w:before="168"/>
-              <w:ind w:left="1168"/>
+              <w:spacing w:before="40" w:after="40"/>
+              <w:ind w:left="0" w:firstLine="0" w:right="0"/>
+              <w:jc w:val="center"/>
               <w:rPr>
                 <w:sz w:val="28"/>
               </w:rPr>
             </w:pPr>
             <w:r>
               <w:rPr>
-                <w:spacing w:val="-2"/>
-                <w:sz w:val="28"/>
+                <w:rFonts w:ascii="Times New Roman" w:hAnsi="Times New Roman" w:cs="Times New Roman" w:eastAsia="Times New Roman"/>
+                <w:b w:val="0"/>
+                <w:sz w:val="24"/>
               </w:rPr>
               <w:t>Dnyaneshwar Mengal</w:t>
             </w:r>
@@ -3896,26 +3807,20 @@
           <w:p>
             <w:pPr>
               <w:pStyle w:val="TableParagraph"/>
-              <w:spacing w:before="115"/>
-              <w:ind w:right="860"/>
-              <w:jc w:val="right"/>
+              <w:spacing w:before="40" w:after="40"/>
+              <w:ind w:right="0" w:firstLine="0" w:left="0"/>
+              <w:jc w:val="center"/>
               <w:rPr>
                 <w:sz w:val="28"/>
               </w:rPr>
             </w:pPr>
             <w:r>
               <w:rPr>
-                <w:spacing w:val="-2"/>
-                <w:sz w:val="28"/>
+                <w:rFonts w:ascii="Times New Roman" w:hAnsi="Times New Roman" w:cs="Times New Roman" w:eastAsia="Times New Roman"/>
+                <w:b w:val="0"/>
+                <w:sz w:val="24"/>
               </w:rPr>
-              <w:t>23061</w:t>
-            </w:r>
-            <w:r>
-              <w:rPr>
-                <w:spacing w:val="-2"/>
-                <w:sz w:val="28"/>
-              </w:rPr>
-              <w:t>17</w:t>
+              <w:t>2306117</w:t>
             </w:r>
           </w:p>
         </w:tc>
@@ -4010,24 +3915,20 @@
           <w:p>
             <w:pPr>
               <w:pStyle w:val="TableParagraph"/>
-              <w:spacing w:line="257" w:lineRule="exact"/>
-              <w:ind w:left="162"/>
+              <w:spacing w:line="257" w:lineRule="exact" w:before="40" w:after="40"/>
+              <w:ind w:left="0" w:firstLine="0" w:right="0"/>
+              <w:jc w:val="center"/>
               <w:rPr>
                 <w:sz w:val="24"/>
               </w:rPr>
             </w:pPr>
             <w:r>
               <w:rPr>
+                <w:rFonts w:ascii="Times New Roman" w:hAnsi="Times New Roman" w:cs="Times New Roman" w:eastAsia="Times New Roman"/>
+                <w:b w:val="0"/>
                 <w:sz w:val="24"/>
               </w:rPr>
-              <w:t>Course</w:t>
-            </w:r>
-            <w:r>
-              <w:rPr>
-                <w:spacing w:val="-4"/>
-                <w:sz w:val="24"/>
-              </w:rPr>
-              <w:t xml:space="preserve"> Guide</w:t>
+              <w:t>_________________</w:t>
             </w:r>
           </w:p>
         </w:tc>
@@ -4038,8 +3939,8 @@
           <w:p>
             <w:pPr>
               <w:pStyle w:val="TableParagraph"/>
-              <w:spacing w:line="257" w:lineRule="exact"/>
-              <w:ind w:left="44" w:right="21"/>
+              <w:spacing w:line="257" w:lineRule="exact" w:before="40" w:after="40"/>
+              <w:ind w:left="0" w:right="0" w:firstLine="0"/>
               <w:jc w:val="center"/>
               <w:rPr>
                 <w:sz w:val="24"/>
@@ -4047,36 +3948,11 @@
             </w:pPr>
             <w:r>
               <w:rPr>
+                <w:rFonts w:ascii="Times New Roman" w:hAnsi="Times New Roman" w:cs="Times New Roman" w:eastAsia="Times New Roman"/>
+                <w:b w:val="0"/>
                 <w:sz w:val="24"/>
               </w:rPr>
-              <w:t>Head</w:t>
-            </w:r>
-            <w:r>
-              <w:rPr>
-                <w:spacing w:val="-3"/>
-                <w:sz w:val="24"/>
-              </w:rPr>
-              <w:t xml:space="preserve"> </w:t>
-            </w:r>
-            <w:r>
-              <w:rPr>
-                <w:sz w:val="24"/>
-              </w:rPr>
-              <w:t>Of</w:t>
-            </w:r>
-            <w:r>
-              <w:rPr>
-                <w:spacing w:val="-3"/>
-                <w:sz w:val="24"/>
-              </w:rPr>
-              <w:t xml:space="preserve"> </w:t>
-            </w:r>
-            <w:r>
-              <w:rPr>
-                <w:spacing w:val="-2"/>
-                <w:sz w:val="24"/>
-              </w:rPr>
-              <w:t>Department</w:t>
+              <w:t>_________________</w:t>
             </w:r>
           </w:p>
         </w:tc>
@@ -4087,8 +3963,8 @@
           <w:p>
             <w:pPr>
               <w:pStyle w:val="TableParagraph"/>
-              <w:spacing w:line="257" w:lineRule="exact"/>
-              <w:ind w:left="822"/>
+              <w:spacing w:line="257" w:lineRule="exact" w:before="40" w:after="40"/>
+              <w:ind w:left="0" w:firstLine="0" w:right="0"/>
               <w:jc w:val="center"/>
               <w:rPr>
                 <w:sz w:val="24"/>
@@ -4096,10 +3972,11 @@
             </w:pPr>
             <w:r>
               <w:rPr>
-                <w:spacing w:val="-2"/>
+                <w:rFonts w:ascii="Times New Roman" w:hAnsi="Times New Roman" w:cs="Times New Roman" w:eastAsia="Times New Roman"/>
+                <w:b w:val="0"/>
                 <w:sz w:val="24"/>
               </w:rPr>
-              <w:t>Principal</w:t>
+              <w:t>_________________</w:t>
             </w:r>
           </w:p>
         </w:tc>
@@ -4115,26 +3992,17 @@
           <w:p>
             <w:pPr>
               <w:pStyle w:val="TableParagraph"/>
-              <w:spacing w:before="19" w:line="237" w:lineRule="exact"/>
-              <w:ind w:left="50"/>
+              <w:spacing w:before="200" w:line="237" w:lineRule="exact" w:after="40"/>
+              <w:ind w:left="0" w:firstLine="0" w:right="0"/>
+              <w:jc w:val="center"/>
             </w:pPr>
             <w:r>
               <w:rPr>
-                <w:spacing w:val="-2"/>
+                <w:rFonts w:ascii="Times New Roman" w:hAnsi="Times New Roman" w:cs="Times New Roman" w:eastAsia="Times New Roman"/>
+                <w:b/>
+                <w:sz w:val="28"/>
               </w:rPr>
-              <w:t>(Smt.</w:t>
-            </w:r>
-            <w:r>
-              <w:rPr>
-                <w:spacing w:val="-2"/>
-              </w:rPr>
-              <w:t>S.B.Gosavi</w:t>
-            </w:r>
-            <w:r>
-              <w:rPr>
-                <w:spacing w:val="-2"/>
-              </w:rPr>
-              <w:t>)</w:t>
+              <w:t>Smt.S.B.Gosavi</w:t>
             </w:r>
           </w:p>
         </w:tc>
@@ -4145,8 +4013,8 @@
           <w:p>
             <w:pPr>
               <w:pStyle w:val="TableParagraph"/>
-              <w:spacing w:before="1" w:line="256" w:lineRule="exact"/>
-              <w:ind w:left="23" w:right="44"/>
+              <w:spacing w:before="200" w:line="256" w:lineRule="exact" w:after="40"/>
+              <w:ind w:left="0" w:right="0" w:firstLine="0"/>
               <w:jc w:val="center"/>
               <w:rPr>
                 <w:sz w:val="24"/>
@@ -4154,23 +4022,11 @@
             </w:pPr>
             <w:r>
               <w:rPr>
-                <w:sz w:val="24"/>
+                <w:rFonts w:ascii="Times New Roman" w:hAnsi="Times New Roman" w:cs="Times New Roman" w:eastAsia="Times New Roman"/>
+                <w:b/>
+                <w:sz w:val="28"/>
               </w:rPr>
-              <w:t>(Smt.</w:t>
-            </w:r>
-            <w:r>
-              <w:rPr>
-                <w:spacing w:val="1"/>
-                <w:sz w:val="24"/>
-              </w:rPr>
-              <w:t xml:space="preserve"> </w:t>
-            </w:r>
-            <w:r>
-              <w:rPr>
-                <w:spacing w:val="-2"/>
-                <w:sz w:val="24"/>
-              </w:rPr>
-              <w:t>J.R.Hange)</w:t>
+              <w:t>Smt.J.R.Hange</w:t>
             </w:r>
           </w:p>
         </w:tc>
@@ -4181,8 +4037,8 @@
           <w:p>
             <w:pPr>
               <w:pStyle w:val="TableParagraph"/>
-              <w:spacing w:before="1" w:line="256" w:lineRule="exact"/>
-              <w:ind w:left="811"/>
+              <w:spacing w:before="200" w:line="256" w:lineRule="exact" w:after="40"/>
+              <w:ind w:left="0" w:firstLine="0" w:right="0"/>
               <w:jc w:val="center"/>
               <w:rPr>
                 <w:sz w:val="24"/>
@@ -4190,24 +4046,11 @@
             </w:pPr>
             <w:r>
               <w:rPr>
-                <w:spacing w:val="-2"/>
-                <w:sz w:val="24"/>
+                <w:rFonts w:ascii="Times New Roman" w:hAnsi="Times New Roman" w:cs="Times New Roman" w:eastAsia="Times New Roman"/>
+                <w:b/>
+                <w:sz w:val="28"/>
               </w:rPr>
-              <w:t>(Dr.</w:t>
-            </w:r>
-            <w:r>
-              <w:rPr>
-                <w:spacing w:val="-13"/>
-                <w:sz w:val="24"/>
-              </w:rPr>
-              <w:t xml:space="preserve"> </w:t>
-            </w:r>
-            <w:r>
-              <w:rPr>
-                <w:spacing w:val="-2"/>
-                <w:sz w:val="24"/>
-              </w:rPr>
-              <w:t>R.K.Patil)</w:t>
+              <w:t>Dr.R.K.Patil</w:t>
             </w:r>
           </w:p>
         </w:tc>
@@ -4617,10 +4460,25 @@
         </w:sectPr>
       </w:pPr>
     </w:p>
+    <w:p>
+      <w:pPr>
+        <w:spacing w:after="480"/>
+        <w:jc w:val="center"/>
+      </w:pPr>
+      <w:r>
+        <w:rPr>
+          <w:rFonts w:ascii="Times New Roman" w:hAnsi="Times New Roman" w:cs="Times New Roman" w:eastAsia="Times New Roman"/>
+          <w:b/>
+          <w:sz w:val="28"/>
+        </w:rPr>
+        <w:t>INDEX</w:t>
+      </w:r>
+    </w:p>
     <w:tbl>
       <w:tblPr>
-        <w:tblW w:w="0" w:type="auto"/>
-        <w:tblInd w:w="725" w:type="dxa"/>
+        <w:tblW w:type="dxa" w:w="9360"/>
+        <w:tblLook w:firstColumn="1" w:firstRow="1" w:lastColumn="0" w:lastRow="0" w:noHBand="0" w:noVBand="1" w:val="04A0"/>
+        <w:jc w:val="center"/>
         <w:tblBorders>
           <w:top w:val="single" w:sz="4" w:space="0" w:color="000000"/>
           <w:left w:val="single" w:sz="4" w:space="0" w:color="000000"/>
@@ -4629,158 +4487,100 @@
           <w:insideH w:val="single" w:sz="4" w:space="0" w:color="000000"/>
           <w:insideV w:val="single" w:sz="4" w:space="0" w:color="000000"/>
         </w:tblBorders>
-        <w:tblLayout w:type="fixed"/>
-        <w:tblCellMar>
-          <w:left w:w="0" w:type="dxa"/>
-          <w:right w:w="0" w:type="dxa"/>
-        </w:tblCellMar>
-        <w:tblLook w:val="01E0" w:firstRow="1" w:lastRow="1" w:firstColumn="1" w:lastColumn="1" w:noHBand="0" w:noVBand="0"/>
       </w:tblPr>
       <w:tblGrid>
-        <w:gridCol w:w="674"/>
-        <w:gridCol w:w="7264"/>
+        <w:gridCol w:w="1843"/>
+        <w:gridCol w:w="5644"/>
+        <w:gridCol w:w="1872"/>
       </w:tblGrid>
       <w:tr>
         <w:trPr>
-          <w:trHeight w:val="1029"/>
+          <w:trHeight w:val="806"/>
         </w:trPr>
         <w:tc>
           <w:tcPr>
-            <w:tcW w:w="674" w:type="dxa"/>
+            <w:tcW w:type="dxa" w:w="1843"/>
+            <w:vAlign w:val="top"/>
           </w:tcPr>
           <w:p>
             <w:pPr>
-              <w:pStyle w:val="TableParagraph"/>
-              <w:spacing w:before="43" w:line="339" w:lineRule="exact"/>
-              <w:ind w:left="122"/>
+              <w:spacing w:before="40" w:after="40"/>
+              <w:ind w:firstLine="0" w:left="0" w:right="0"/>
+              <w:jc w:val="center"/>
+            </w:pPr>
+            <w:r>
               <w:rPr>
                 <w:rFonts w:ascii="Times New Roman" w:hAnsi="Times New Roman" w:cs="Times New Roman" w:eastAsia="Times New Roman"/>
                 <w:b/>
                 <w:sz w:val="28"/>
               </w:rPr>
+              <w:t>Sr no</w:t>
+            </w:r>
+          </w:p>
+        </w:tc>
+        <w:tc>
+          <w:tcPr>
+            <w:tcW w:type="dxa" w:w="5645"/>
+            <w:vAlign w:val="top"/>
+          </w:tcPr>
+          <w:p>
+            <w:pPr>
+              <w:spacing w:before="40" w:after="40"/>
+              <w:ind w:firstLine="0" w:left="0" w:right="0"/>
+              <w:jc w:val="center"/>
             </w:pPr>
             <w:r>
               <w:rPr>
                 <w:rFonts w:ascii="Times New Roman" w:hAnsi="Times New Roman" w:cs="Times New Roman" w:eastAsia="Times New Roman"/>
                 <w:b/>
-                <w:spacing w:val="-5"/>
-                <w:w w:val="110"/>
-                <w:sz w:val="28"/>
-              </w:rPr>
-              <w:lastRenderedPageBreak/>
-              <w:t>Sr.</w:t>
-            </w:r>
-          </w:p>
-          <w:p>
-            <w:pPr>
-              <w:pStyle w:val="TableParagraph"/>
-              <w:spacing w:line="339" w:lineRule="exact"/>
-              <w:ind w:left="122"/>
-              <w:rPr>
-                <w:rFonts w:ascii="Times New Roman" w:hAnsi="Times New Roman" w:cs="Times New Roman" w:eastAsia="Times New Roman"/>
-                <w:b/>
-                <w:sz w:val="28"/>
-              </w:rPr>
-            </w:pPr>
-            <w:r>
-              <w:rPr>
-                <w:rFonts w:ascii="Times New Roman" w:hAnsi="Times New Roman" w:cs="Times New Roman" w:eastAsia="Times New Roman"/>
-                <w:b/>
-                <w:spacing w:val="-5"/>
-                <w:sz w:val="28"/>
-              </w:rPr>
-              <w:t>No.</w:t>
-            </w:r>
-          </w:p>
-        </w:tc>
-        <w:tc>
-          <w:tcPr>
-            <w:tcW w:w="7264" w:type="dxa"/>
-          </w:tcPr>
-          <w:p>
-            <w:pPr>
-              <w:pStyle w:val="TableParagraph"/>
-              <w:spacing w:before="43"/>
-              <w:ind w:left="42"/>
-              <w:jc w:val="center"/>
-              <w:rPr>
-                <w:rFonts w:ascii="Times New Roman" w:hAnsi="Times New Roman" w:cs="Times New Roman" w:eastAsia="Times New Roman"/>
-                <w:b/>
-                <w:sz w:val="28"/>
-              </w:rPr>
-            </w:pPr>
-            <w:r>
-              <w:rPr>
-                <w:rFonts w:ascii="Times New Roman" w:hAnsi="Times New Roman" w:cs="Times New Roman" w:eastAsia="Times New Roman"/>
-                <w:b/>
-                <w:w w:val="110"/>
-                <w:sz w:val="28"/>
-              </w:rPr>
-              <w:t>Title</w:t>
-            </w:r>
-            <w:r>
-              <w:rPr>
-                <w:rFonts w:ascii="Times New Roman" w:hAnsi="Times New Roman" w:cs="Times New Roman" w:eastAsia="Times New Roman"/>
-                <w:b/>
-                <w:spacing w:val="-1"/>
-                <w:w w:val="110"/>
-                <w:sz w:val="28"/>
-              </w:rPr>
-              <w:t xml:space="preserve"> </w:t>
-            </w:r>
-            <w:r>
-              <w:rPr>
-                <w:rFonts w:ascii="Times New Roman" w:hAnsi="Times New Roman" w:cs="Times New Roman" w:eastAsia="Times New Roman"/>
-                <w:b/>
-                <w:w w:val="110"/>
-                <w:sz w:val="28"/>
-              </w:rPr>
-              <w:t xml:space="preserve">of </w:t>
-            </w:r>
-            <w:r>
-              <w:rPr>
-                <w:rFonts w:ascii="Times New Roman" w:hAnsi="Times New Roman" w:cs="Times New Roman" w:eastAsia="Times New Roman"/>
-                <w:b/>
-                <w:spacing w:val="-2"/>
-                <w:w w:val="110"/>
                 <w:sz w:val="28"/>
               </w:rPr>
               <w:t>Content</w:t>
             </w:r>
           </w:p>
         </w:tc>
-      </w:tr>
-      <w:tr>
-        <w:trPr>
-          <w:trHeight w:val="863"/>
-        </w:trPr>
         <w:tc>
           <w:tcPr>
-            <w:tcW w:w="674" w:type="dxa"/>
+            <w:tcW w:type="dxa" w:w="1872"/>
+            <w:vAlign w:val="top"/>
           </w:tcPr>
           <w:p>
             <w:pPr>
-              <w:pStyle w:val="TableParagraph"/>
-              <w:spacing w:before="142"/>
-              <w:rPr>
-                <w:sz w:val="26"/>
-              </w:rPr>
-            </w:pPr>
-          </w:p>
-          <w:p>
-            <w:pPr>
-              <w:pStyle w:val="TableParagraph"/>
-              <w:ind w:left="122"/>
-              <w:rPr>
-                <w:rFonts w:ascii="Times New Roman" w:hAnsi="Times New Roman" w:cs="Times New Roman" w:eastAsia="Times New Roman"/>
-                <w:sz w:val="26"/>
-              </w:rPr>
+              <w:spacing w:before="40" w:after="40"/>
+              <w:ind w:firstLine="0" w:left="0" w:right="0"/>
+              <w:jc w:val="center"/>
             </w:pPr>
             <w:r>
               <w:rPr>
                 <w:rFonts w:ascii="Times New Roman" w:hAnsi="Times New Roman" w:cs="Times New Roman" w:eastAsia="Times New Roman"/>
-                <w:spacing w:val="-5"/>
-                <w:sz w:val="26"/>
+                <w:b/>
+                <w:sz w:val="28"/>
+              </w:rPr>
+              <w:t>Page</w:t>
+            </w:r>
+          </w:p>
+        </w:tc>
+      </w:tr>
+      <w:tr>
+        <w:trPr>
+          <w:trHeight w:val="806"/>
+        </w:trPr>
+        <w:tc>
+          <w:tcPr>
+            <w:tcW w:type="dxa" w:w="1843"/>
+            <w:vAlign w:val="top"/>
+          </w:tcPr>
+          <w:p>
+            <w:pPr>
+              <w:spacing w:before="40" w:after="40"/>
+              <w:ind w:firstLine="0" w:left="0" w:right="0"/>
+              <w:jc w:val="center"/>
+            </w:pPr>
+            <w:r>
+              <w:rPr>
+                <w:rFonts w:ascii="Times New Roman" w:hAnsi="Times New Roman" w:cs="Times New Roman" w:eastAsia="Times New Roman"/>
+                <w:b w:val="0"/>
+                <w:sz w:val="24"/>
               </w:rPr>
               <w:t>1.</w:t>
             </w:r>
@@ -4788,68 +4588,67 @@
         </w:tc>
         <w:tc>
           <w:tcPr>
-            <w:tcW w:w="7264" w:type="dxa"/>
+            <w:tcW w:type="dxa" w:w="5645"/>
+            <w:vAlign w:val="top"/>
           </w:tcPr>
           <w:p>
             <w:pPr>
-              <w:pStyle w:val="TableParagraph"/>
-              <w:spacing w:before="95"/>
-              <w:rPr>
-                <w:sz w:val="28"/>
-              </w:rPr>
-            </w:pPr>
-          </w:p>
-          <w:p>
-            <w:pPr>
-              <w:pStyle w:val="TableParagraph"/>
-              <w:ind w:left="122"/>
-              <w:rPr>
-                <w:rFonts w:ascii="Times New Roman" w:hAnsi="Times New Roman" w:cs="Times New Roman" w:eastAsia="Times New Roman"/>
-                <w:sz w:val="28"/>
-              </w:rPr>
+              <w:spacing w:before="40" w:after="40"/>
+              <w:ind w:firstLine="0" w:left="0" w:right="0"/>
+              <w:jc w:val="center"/>
             </w:pPr>
             <w:r>
               <w:rPr>
                 <w:rFonts w:ascii="Times New Roman" w:hAnsi="Times New Roman" w:cs="Times New Roman" w:eastAsia="Times New Roman"/>
-                <w:spacing w:val="-2"/>
-                <w:sz w:val="28"/>
+                <w:b w:val="0"/>
+                <w:sz w:val="24"/>
               </w:rPr>
               <w:t>Abstract</w:t>
+            </w:r>
+          </w:p>
+        </w:tc>
+        <w:tc>
+          <w:tcPr>
+            <w:tcW w:type="dxa" w:w="1872"/>
+            <w:vAlign w:val="top"/>
+          </w:tcPr>
+          <w:p>
+            <w:pPr>
+              <w:spacing w:before="40" w:after="40"/>
+              <w:ind w:firstLine="0" w:left="0" w:right="0"/>
+              <w:jc w:val="center"/>
+            </w:pPr>
+            <w:r>
+              <w:rPr>
+                <w:rFonts w:ascii="Times New Roman" w:hAnsi="Times New Roman" w:cs="Times New Roman" w:eastAsia="Times New Roman"/>
+                <w:b w:val="0"/>
+                <w:sz w:val="24"/>
+              </w:rPr>
+              <w:t>1</w:t>
             </w:r>
           </w:p>
         </w:tc>
       </w:tr>
       <w:tr>
         <w:trPr>
-          <w:trHeight w:val="890"/>
+          <w:trHeight w:val="806"/>
         </w:trPr>
         <w:tc>
           <w:tcPr>
-            <w:tcW w:w="674" w:type="dxa"/>
+            <w:tcW w:type="dxa" w:w="1843"/>
+            <w:vAlign w:val="top"/>
           </w:tcPr>
           <w:p>
             <w:pPr>
-              <w:pStyle w:val="TableParagraph"/>
-              <w:spacing w:before="122"/>
-              <w:rPr>
-                <w:sz w:val="28"/>
-              </w:rPr>
-            </w:pPr>
-          </w:p>
-          <w:p>
-            <w:pPr>
-              <w:pStyle w:val="TableParagraph"/>
-              <w:ind w:left="122"/>
-              <w:rPr>
-                <w:rFonts w:ascii="Times New Roman" w:hAnsi="Times New Roman" w:cs="Times New Roman" w:eastAsia="Times New Roman"/>
-                <w:sz w:val="28"/>
-              </w:rPr>
+              <w:spacing w:before="40" w:after="40"/>
+              <w:ind w:firstLine="0" w:left="0" w:right="0"/>
+              <w:jc w:val="center"/>
             </w:pPr>
             <w:r>
               <w:rPr>
                 <w:rFonts w:ascii="Times New Roman" w:hAnsi="Times New Roman" w:cs="Times New Roman" w:eastAsia="Times New Roman"/>
-                <w:spacing w:val="-5"/>
-                <w:sz w:val="28"/>
+                <w:b w:val="0"/>
+                <w:sz w:val="24"/>
               </w:rPr>
               <w:t>2.</w:t>
             </w:r>
@@ -4857,68 +4656,67 @@
         </w:tc>
         <w:tc>
           <w:tcPr>
-            <w:tcW w:w="7264" w:type="dxa"/>
+            <w:tcW w:type="dxa" w:w="5645"/>
+            <w:vAlign w:val="top"/>
           </w:tcPr>
           <w:p>
             <w:pPr>
-              <w:pStyle w:val="TableParagraph"/>
-              <w:spacing w:before="122"/>
-              <w:rPr>
-                <w:sz w:val="28"/>
-              </w:rPr>
-            </w:pPr>
-          </w:p>
-          <w:p>
-            <w:pPr>
-              <w:pStyle w:val="TableParagraph"/>
-              <w:ind w:left="122"/>
-              <w:rPr>
-                <w:rFonts w:ascii="Times New Roman" w:hAnsi="Times New Roman" w:cs="Times New Roman" w:eastAsia="Times New Roman"/>
-                <w:sz w:val="28"/>
-              </w:rPr>
+              <w:spacing w:before="40" w:after="40"/>
+              <w:ind w:firstLine="0" w:left="0" w:right="0"/>
+              <w:jc w:val="center"/>
             </w:pPr>
             <w:r>
               <w:rPr>
                 <w:rFonts w:ascii="Times New Roman" w:hAnsi="Times New Roman" w:cs="Times New Roman" w:eastAsia="Times New Roman"/>
-                <w:spacing w:val="-2"/>
-                <w:sz w:val="28"/>
+                <w:b w:val="0"/>
+                <w:sz w:val="24"/>
               </w:rPr>
               <w:t>Introduction</w:t>
+            </w:r>
+          </w:p>
+        </w:tc>
+        <w:tc>
+          <w:tcPr>
+            <w:tcW w:type="dxa" w:w="1872"/>
+            <w:vAlign w:val="top"/>
+          </w:tcPr>
+          <w:p>
+            <w:pPr>
+              <w:spacing w:before="40" w:after="40"/>
+              <w:ind w:firstLine="0" w:left="0" w:right="0"/>
+              <w:jc w:val="center"/>
+            </w:pPr>
+            <w:r>
+              <w:rPr>
+                <w:rFonts w:ascii="Times New Roman" w:hAnsi="Times New Roman" w:cs="Times New Roman" w:eastAsia="Times New Roman"/>
+                <w:b w:val="0"/>
+                <w:sz w:val="24"/>
+              </w:rPr>
+              <w:t>2</w:t>
             </w:r>
           </w:p>
         </w:tc>
       </w:tr>
       <w:tr>
         <w:trPr>
-          <w:trHeight w:val="854"/>
+          <w:trHeight w:val="806"/>
         </w:trPr>
         <w:tc>
           <w:tcPr>
-            <w:tcW w:w="674" w:type="dxa"/>
+            <w:tcW w:type="dxa" w:w="1843"/>
+            <w:vAlign w:val="top"/>
           </w:tcPr>
           <w:p>
             <w:pPr>
-              <w:pStyle w:val="TableParagraph"/>
-              <w:spacing w:before="86"/>
-              <w:rPr>
-                <w:sz w:val="28"/>
-              </w:rPr>
-            </w:pPr>
-          </w:p>
-          <w:p>
-            <w:pPr>
-              <w:pStyle w:val="TableParagraph"/>
-              <w:ind w:left="122"/>
-              <w:rPr>
-                <w:rFonts w:ascii="Times New Roman" w:hAnsi="Times New Roman" w:cs="Times New Roman" w:eastAsia="Times New Roman"/>
-                <w:sz w:val="28"/>
-              </w:rPr>
+              <w:spacing w:before="40" w:after="40"/>
+              <w:ind w:firstLine="0" w:left="0" w:right="0"/>
+              <w:jc w:val="center"/>
             </w:pPr>
             <w:r>
               <w:rPr>
                 <w:rFonts w:ascii="Times New Roman" w:hAnsi="Times New Roman" w:cs="Times New Roman" w:eastAsia="Times New Roman"/>
-                <w:spacing w:val="-5"/>
-                <w:sz w:val="28"/>
+                <w:b w:val="0"/>
+                <w:sz w:val="24"/>
               </w:rPr>
               <w:t>3.</w:t>
             </w:r>
@@ -4926,68 +4724,67 @@
         </w:tc>
         <w:tc>
           <w:tcPr>
-            <w:tcW w:w="7264" w:type="dxa"/>
+            <w:tcW w:type="dxa" w:w="5645"/>
+            <w:vAlign w:val="top"/>
           </w:tcPr>
           <w:p>
             <w:pPr>
-              <w:pStyle w:val="TableParagraph"/>
-              <w:spacing w:before="86"/>
-              <w:rPr>
-                <w:sz w:val="28"/>
-              </w:rPr>
-            </w:pPr>
-          </w:p>
-          <w:p>
-            <w:pPr>
-              <w:pStyle w:val="TableParagraph"/>
-              <w:ind w:left="122"/>
-              <w:rPr>
-                <w:rFonts w:ascii="Times New Roman" w:hAnsi="Times New Roman" w:cs="Times New Roman" w:eastAsia="Times New Roman"/>
-                <w:sz w:val="28"/>
-              </w:rPr>
+              <w:spacing w:before="40" w:after="40"/>
+              <w:ind w:firstLine="0" w:left="0" w:right="0"/>
+              <w:jc w:val="center"/>
             </w:pPr>
             <w:r>
               <w:rPr>
                 <w:rFonts w:ascii="Times New Roman" w:hAnsi="Times New Roman" w:cs="Times New Roman" w:eastAsia="Times New Roman"/>
-                <w:spacing w:val="-2"/>
-                <w:sz w:val="28"/>
+                <w:b w:val="0"/>
+                <w:sz w:val="24"/>
               </w:rPr>
               <w:t>Objective</w:t>
+            </w:r>
+          </w:p>
+        </w:tc>
+        <w:tc>
+          <w:tcPr>
+            <w:tcW w:type="dxa" w:w="1872"/>
+            <w:vAlign w:val="top"/>
+          </w:tcPr>
+          <w:p>
+            <w:pPr>
+              <w:spacing w:before="40" w:after="40"/>
+              <w:ind w:firstLine="0" w:left="0" w:right="0"/>
+              <w:jc w:val="center"/>
+            </w:pPr>
+            <w:r>
+              <w:rPr>
+                <w:rFonts w:ascii="Times New Roman" w:hAnsi="Times New Roman" w:cs="Times New Roman" w:eastAsia="Times New Roman"/>
+                <w:b w:val="0"/>
+                <w:sz w:val="24"/>
+              </w:rPr>
+              <w:t>2</w:t>
             </w:r>
           </w:p>
         </w:tc>
       </w:tr>
       <w:tr>
         <w:trPr>
-          <w:trHeight w:val="863"/>
+          <w:trHeight w:val="806"/>
         </w:trPr>
         <w:tc>
           <w:tcPr>
-            <w:tcW w:w="674" w:type="dxa"/>
+            <w:tcW w:type="dxa" w:w="1843"/>
+            <w:vAlign w:val="top"/>
           </w:tcPr>
           <w:p>
             <w:pPr>
-              <w:pStyle w:val="TableParagraph"/>
-              <w:spacing w:before="95"/>
-              <w:rPr>
-                <w:sz w:val="28"/>
-              </w:rPr>
-            </w:pPr>
-          </w:p>
-          <w:p>
-            <w:pPr>
-              <w:pStyle w:val="TableParagraph"/>
-              <w:ind w:left="122"/>
-              <w:rPr>
-                <w:rFonts w:ascii="Times New Roman" w:hAnsi="Times New Roman" w:cs="Times New Roman" w:eastAsia="Times New Roman"/>
-                <w:sz w:val="28"/>
-              </w:rPr>
+              <w:spacing w:before="40" w:after="40"/>
+              <w:ind w:firstLine="0" w:left="0" w:right="0"/>
+              <w:jc w:val="center"/>
             </w:pPr>
             <w:r>
               <w:rPr>
                 <w:rFonts w:ascii="Times New Roman" w:hAnsi="Times New Roman" w:cs="Times New Roman" w:eastAsia="Times New Roman"/>
-                <w:spacing w:val="-5"/>
-                <w:sz w:val="28"/>
+                <w:b w:val="0"/>
+                <w:sz w:val="24"/>
               </w:rPr>
               <w:t>4.</w:t>
             </w:r>
@@ -4995,75 +4792,67 @@
         </w:tc>
         <w:tc>
           <w:tcPr>
-            <w:tcW w:w="7264" w:type="dxa"/>
+            <w:tcW w:type="dxa" w:w="5645"/>
+            <w:vAlign w:val="top"/>
           </w:tcPr>
           <w:p>
             <w:pPr>
-              <w:pStyle w:val="TableParagraph"/>
-              <w:spacing w:before="95"/>
-              <w:rPr>
-                <w:sz w:val="28"/>
-              </w:rPr>
-            </w:pPr>
-          </w:p>
-          <w:p>
-            <w:pPr>
-              <w:pStyle w:val="TableParagraph"/>
-              <w:ind w:left="122"/>
-              <w:rPr>
-                <w:rFonts w:ascii="Times New Roman" w:hAnsi="Times New Roman" w:cs="Times New Roman" w:eastAsia="Times New Roman"/>
-                <w:sz w:val="28"/>
-              </w:rPr>
+              <w:spacing w:before="40" w:after="40"/>
+              <w:ind w:firstLine="0" w:left="0" w:right="0"/>
+              <w:jc w:val="center"/>
             </w:pPr>
             <w:r>
               <w:rPr>
                 <w:rFonts w:ascii="Times New Roman" w:hAnsi="Times New Roman" w:cs="Times New Roman" w:eastAsia="Times New Roman"/>
-                <w:sz w:val="28"/>
+                <w:b w:val="0"/>
+                <w:sz w:val="24"/>
               </w:rPr>
-              <w:t xml:space="preserve">System </w:t>
+              <w:t>System Architecture</w:t>
             </w:r>
+          </w:p>
+        </w:tc>
+        <w:tc>
+          <w:tcPr>
+            <w:tcW w:type="dxa" w:w="1872"/>
+            <w:vAlign w:val="top"/>
+          </w:tcPr>
+          <w:p>
+            <w:pPr>
+              <w:spacing w:before="40" w:after="40"/>
+              <w:ind w:firstLine="0" w:left="0" w:right="0"/>
+              <w:jc w:val="center"/>
+            </w:pPr>
             <w:r>
               <w:rPr>
                 <w:rFonts w:ascii="Times New Roman" w:hAnsi="Times New Roman" w:cs="Times New Roman" w:eastAsia="Times New Roman"/>
-                <w:spacing w:val="-2"/>
-                <w:sz w:val="28"/>
+                <w:b w:val="0"/>
+                <w:sz w:val="24"/>
               </w:rPr>
-              <w:t>Architecture</w:t>
+              <w:t>3</w:t>
             </w:r>
           </w:p>
         </w:tc>
       </w:tr>
       <w:tr>
         <w:trPr>
-          <w:trHeight w:val="890"/>
+          <w:trHeight w:val="806"/>
         </w:trPr>
         <w:tc>
           <w:tcPr>
-            <w:tcW w:w="674" w:type="dxa"/>
+            <w:tcW w:type="dxa" w:w="1843"/>
+            <w:vAlign w:val="top"/>
           </w:tcPr>
           <w:p>
             <w:pPr>
-              <w:pStyle w:val="TableParagraph"/>
-              <w:spacing w:before="119"/>
-              <w:rPr>
-                <w:sz w:val="28"/>
-              </w:rPr>
-            </w:pPr>
-          </w:p>
-          <w:p>
-            <w:pPr>
-              <w:pStyle w:val="TableParagraph"/>
-              <w:ind w:left="122"/>
-              <w:rPr>
-                <w:rFonts w:ascii="Times New Roman" w:hAnsi="Times New Roman" w:cs="Times New Roman" w:eastAsia="Times New Roman"/>
-                <w:sz w:val="28"/>
-              </w:rPr>
+              <w:spacing w:before="40" w:after="40"/>
+              <w:ind w:firstLine="0" w:left="0" w:right="0"/>
+              <w:jc w:val="center"/>
             </w:pPr>
             <w:r>
               <w:rPr>
                 <w:rFonts w:ascii="Times New Roman" w:hAnsi="Times New Roman" w:cs="Times New Roman" w:eastAsia="Times New Roman"/>
-                <w:spacing w:val="-5"/>
-                <w:sz w:val="28"/>
+                <w:b w:val="0"/>
+                <w:sz w:val="24"/>
               </w:rPr>
               <w:t>5.</w:t>
             </w:r>
@@ -5071,86 +4860,67 @@
         </w:tc>
         <w:tc>
           <w:tcPr>
-            <w:tcW w:w="7264" w:type="dxa"/>
+            <w:tcW w:type="dxa" w:w="5645"/>
+            <w:vAlign w:val="top"/>
           </w:tcPr>
           <w:p>
             <w:pPr>
-              <w:pStyle w:val="TableParagraph"/>
-              <w:spacing w:before="43"/>
-              <w:rPr>
-                <w:rFonts w:ascii="Times New Roman" w:hAnsi="Times New Roman" w:cs="Times New Roman" w:eastAsia="Times New Roman"/>
-                <w:sz w:val="28"/>
-              </w:rPr>
+              <w:spacing w:before="40" w:after="40"/>
+              <w:ind w:firstLine="0" w:left="0" w:right="0"/>
+              <w:jc w:val="center"/>
             </w:pPr>
-          </w:p>
-          <w:p>
-            <w:pPr>
-              <w:pStyle w:val="TableParagraph"/>
-              <w:spacing w:before="43"/>
-              <w:rPr>
-                <w:rFonts w:ascii="Times New Roman" w:hAnsi="Times New Roman" w:cs="Times New Roman" w:eastAsia="Times New Roman"/>
-                <w:sz w:val="28"/>
-              </w:rPr>
-            </w:pPr>
-            <w:bookmarkStart w:id="0" w:name="_GoBack"/>
-            <w:bookmarkEnd w:id="0"/>
             <w:r>
               <w:rPr>
                 <w:rFonts w:ascii="Times New Roman" w:hAnsi="Times New Roman" w:cs="Times New Roman" w:eastAsia="Times New Roman"/>
-                <w:sz w:val="28"/>
+                <w:b w:val="0"/>
+                <w:sz w:val="24"/>
               </w:rPr>
-              <w:t>Implementation</w:t>
+              <w:t>Implementation Details</w:t>
             </w:r>
+          </w:p>
+        </w:tc>
+        <w:tc>
+          <w:tcPr>
+            <w:tcW w:type="dxa" w:w="1872"/>
+            <w:vAlign w:val="top"/>
+          </w:tcPr>
+          <w:p>
+            <w:pPr>
+              <w:spacing w:before="40" w:after="40"/>
+              <w:ind w:firstLine="0" w:left="0" w:right="0"/>
+              <w:jc w:val="center"/>
+            </w:pPr>
             <w:r>
               <w:rPr>
                 <w:rFonts w:ascii="Times New Roman" w:hAnsi="Times New Roman" w:cs="Times New Roman" w:eastAsia="Times New Roman"/>
-                <w:spacing w:val="-12"/>
-                <w:sz w:val="28"/>
+                <w:b w:val="0"/>
+                <w:sz w:val="24"/>
               </w:rPr>
-              <w:t xml:space="preserve"> </w:t>
-            </w:r>
-            <w:r>
-              <w:rPr>
-                <w:rFonts w:ascii="Times New Roman" w:hAnsi="Times New Roman" w:cs="Times New Roman" w:eastAsia="Times New Roman"/>
-                <w:spacing w:val="-2"/>
-                <w:sz w:val="28"/>
-              </w:rPr>
-              <w:t>Details</w:t>
+              <w:t>3</w:t>
             </w:r>
           </w:p>
         </w:tc>
       </w:tr>
       <w:tr>
         <w:trPr>
-          <w:trHeight w:val="863"/>
+          <w:trHeight w:val="806"/>
         </w:trPr>
         <w:tc>
           <w:tcPr>
-            <w:tcW w:w="674" w:type="dxa"/>
+            <w:tcW w:type="dxa" w:w="1843"/>
+            <w:vAlign w:val="top"/>
           </w:tcPr>
           <w:p>
             <w:pPr>
-              <w:pStyle w:val="TableParagraph"/>
-              <w:spacing w:before="95"/>
-              <w:rPr>
-                <w:sz w:val="28"/>
-              </w:rPr>
-            </w:pPr>
-          </w:p>
-          <w:p>
-            <w:pPr>
-              <w:pStyle w:val="TableParagraph"/>
-              <w:ind w:left="122"/>
-              <w:rPr>
-                <w:rFonts w:ascii="Times New Roman" w:hAnsi="Times New Roman" w:cs="Times New Roman" w:eastAsia="Times New Roman"/>
-                <w:sz w:val="28"/>
-              </w:rPr>
+              <w:spacing w:before="40" w:after="40"/>
+              <w:ind w:firstLine="0" w:left="0" w:right="0"/>
+              <w:jc w:val="center"/>
             </w:pPr>
             <w:r>
               <w:rPr>
                 <w:rFonts w:ascii="Times New Roman" w:hAnsi="Times New Roman" w:cs="Times New Roman" w:eastAsia="Times New Roman"/>
-                <w:spacing w:val="-5"/>
-                <w:sz w:val="28"/>
+                <w:b w:val="0"/>
+                <w:sz w:val="24"/>
               </w:rPr>
               <w:t>6.</w:t>
             </w:r>
@@ -5158,83 +4928,67 @@
         </w:tc>
         <w:tc>
           <w:tcPr>
-            <w:tcW w:w="7264" w:type="dxa"/>
+            <w:tcW w:type="dxa" w:w="5645"/>
+            <w:vAlign w:val="top"/>
           </w:tcPr>
           <w:p>
             <w:pPr>
-              <w:pStyle w:val="TableParagraph"/>
-              <w:spacing w:before="95"/>
-              <w:rPr>
-                <w:sz w:val="28"/>
-              </w:rPr>
-            </w:pPr>
-          </w:p>
-          <w:p>
-            <w:pPr>
-              <w:pStyle w:val="TableParagraph"/>
-              <w:ind w:left="122"/>
-              <w:rPr>
-                <w:rFonts w:ascii="Times New Roman" w:hAnsi="Times New Roman" w:cs="Times New Roman" w:eastAsia="Times New Roman"/>
-                <w:sz w:val="28"/>
-              </w:rPr>
+              <w:spacing w:before="40" w:after="40"/>
+              <w:ind w:firstLine="0" w:left="0" w:right="0"/>
+              <w:jc w:val="center"/>
             </w:pPr>
             <w:r>
               <w:rPr>
                 <w:rFonts w:ascii="Times New Roman" w:hAnsi="Times New Roman" w:cs="Times New Roman" w:eastAsia="Times New Roman"/>
-                <w:sz w:val="28"/>
+                <w:b w:val="0"/>
+                <w:sz w:val="24"/>
               </w:rPr>
-              <w:t>Technologies</w:t>
+              <w:t>Technologies Used</w:t>
             </w:r>
+          </w:p>
+        </w:tc>
+        <w:tc>
+          <w:tcPr>
+            <w:tcW w:type="dxa" w:w="1872"/>
+            <w:vAlign w:val="top"/>
+          </w:tcPr>
+          <w:p>
+            <w:pPr>
+              <w:spacing w:before="40" w:after="40"/>
+              <w:ind w:firstLine="0" w:left="0" w:right="0"/>
+              <w:jc w:val="center"/>
+            </w:pPr>
             <w:r>
               <w:rPr>
                 <w:rFonts w:ascii="Times New Roman" w:hAnsi="Times New Roman" w:cs="Times New Roman" w:eastAsia="Times New Roman"/>
-                <w:spacing w:val="-12"/>
-                <w:sz w:val="28"/>
+                <w:b w:val="0"/>
+                <w:sz w:val="24"/>
               </w:rPr>
-              <w:t xml:space="preserve"> </w:t>
-            </w:r>
-            <w:r>
-              <w:rPr>
-                <w:rFonts w:ascii="Times New Roman" w:hAnsi="Times New Roman" w:cs="Times New Roman" w:eastAsia="Times New Roman"/>
-                <w:spacing w:val="-4"/>
-                <w:sz w:val="28"/>
-              </w:rPr>
-              <w:t>Used</w:t>
+              <w:t>6</w:t>
             </w:r>
           </w:p>
         </w:tc>
       </w:tr>
       <w:tr>
         <w:trPr>
-          <w:trHeight w:val="866"/>
+          <w:trHeight w:val="806"/>
         </w:trPr>
         <w:tc>
           <w:tcPr>
-            <w:tcW w:w="674" w:type="dxa"/>
+            <w:tcW w:type="dxa" w:w="1843"/>
+            <w:vAlign w:val="top"/>
           </w:tcPr>
           <w:p>
             <w:pPr>
-              <w:pStyle w:val="TableParagraph"/>
-              <w:spacing w:before="98"/>
-              <w:rPr>
-                <w:sz w:val="28"/>
-              </w:rPr>
-            </w:pPr>
-          </w:p>
-          <w:p>
-            <w:pPr>
-              <w:pStyle w:val="TableParagraph"/>
-              <w:ind w:left="122"/>
-              <w:rPr>
-                <w:rFonts w:ascii="Times New Roman" w:hAnsi="Times New Roman" w:cs="Times New Roman" w:eastAsia="Times New Roman"/>
-                <w:sz w:val="28"/>
-              </w:rPr>
+              <w:spacing w:before="40" w:after="40"/>
+              <w:ind w:firstLine="0" w:left="0" w:right="0"/>
+              <w:jc w:val="center"/>
             </w:pPr>
             <w:r>
               <w:rPr>
                 <w:rFonts w:ascii="Times New Roman" w:hAnsi="Times New Roman" w:cs="Times New Roman" w:eastAsia="Times New Roman"/>
-                <w:spacing w:val="-5"/>
-                <w:sz w:val="28"/>
+                <w:b w:val="0"/>
+                <w:sz w:val="24"/>
               </w:rPr>
               <w:t>7.</w:t>
             </w:r>
@@ -5242,83 +4996,67 @@
         </w:tc>
         <w:tc>
           <w:tcPr>
-            <w:tcW w:w="7264" w:type="dxa"/>
+            <w:tcW w:type="dxa" w:w="5645"/>
+            <w:vAlign w:val="top"/>
           </w:tcPr>
           <w:p>
             <w:pPr>
-              <w:pStyle w:val="TableParagraph"/>
-              <w:spacing w:before="98"/>
-              <w:rPr>
-                <w:sz w:val="28"/>
-              </w:rPr>
-            </w:pPr>
-          </w:p>
-          <w:p>
-            <w:pPr>
-              <w:pStyle w:val="TableParagraph"/>
-              <w:ind w:left="122"/>
-              <w:rPr>
-                <w:rFonts w:ascii="Times New Roman" w:hAnsi="Times New Roman" w:cs="Times New Roman" w:eastAsia="Times New Roman"/>
-                <w:sz w:val="28"/>
-              </w:rPr>
+              <w:spacing w:before="40" w:after="40"/>
+              <w:ind w:firstLine="0" w:left="0" w:right="0"/>
+              <w:jc w:val="center"/>
             </w:pPr>
             <w:r>
               <w:rPr>
                 <w:rFonts w:ascii="Times New Roman" w:hAnsi="Times New Roman" w:cs="Times New Roman" w:eastAsia="Times New Roman"/>
-                <w:sz w:val="28"/>
+                <w:b w:val="0"/>
+                <w:sz w:val="24"/>
               </w:rPr>
-              <w:t>Project</w:t>
+              <w:t>Project Output</w:t>
             </w:r>
+          </w:p>
+        </w:tc>
+        <w:tc>
+          <w:tcPr>
+            <w:tcW w:type="dxa" w:w="1872"/>
+            <w:vAlign w:val="top"/>
+          </w:tcPr>
+          <w:p>
+            <w:pPr>
+              <w:spacing w:before="40" w:after="40"/>
+              <w:ind w:firstLine="0" w:left="0" w:right="0"/>
+              <w:jc w:val="center"/>
+            </w:pPr>
             <w:r>
               <w:rPr>
                 <w:rFonts w:ascii="Times New Roman" w:hAnsi="Times New Roman" w:cs="Times New Roman" w:eastAsia="Times New Roman"/>
-                <w:spacing w:val="-7"/>
-                <w:sz w:val="28"/>
+                <w:b w:val="0"/>
+                <w:sz w:val="24"/>
               </w:rPr>
-              <w:t xml:space="preserve"> </w:t>
-            </w:r>
-            <w:r>
-              <w:rPr>
-                <w:rFonts w:ascii="Times New Roman" w:hAnsi="Times New Roman" w:cs="Times New Roman" w:eastAsia="Times New Roman"/>
-                <w:spacing w:val="-2"/>
-                <w:sz w:val="28"/>
-              </w:rPr>
-              <w:t>Output</w:t>
+              <w:t>27</w:t>
             </w:r>
           </w:p>
         </w:tc>
       </w:tr>
       <w:tr>
         <w:trPr>
-          <w:trHeight w:val="866"/>
+          <w:trHeight w:val="806"/>
         </w:trPr>
         <w:tc>
           <w:tcPr>
-            <w:tcW w:w="674" w:type="dxa"/>
+            <w:tcW w:type="dxa" w:w="1843"/>
+            <w:vAlign w:val="top"/>
           </w:tcPr>
           <w:p>
             <w:pPr>
-              <w:pStyle w:val="TableParagraph"/>
-              <w:spacing w:before="98"/>
-              <w:rPr>
-                <w:sz w:val="28"/>
-              </w:rPr>
-            </w:pPr>
-          </w:p>
-          <w:p>
-            <w:pPr>
-              <w:pStyle w:val="TableParagraph"/>
-              <w:ind w:left="122"/>
-              <w:rPr>
-                <w:rFonts w:ascii="Times New Roman" w:hAnsi="Times New Roman" w:cs="Times New Roman" w:eastAsia="Times New Roman"/>
-                <w:sz w:val="28"/>
-              </w:rPr>
+              <w:spacing w:before="40" w:after="40"/>
+              <w:ind w:firstLine="0" w:left="0" w:right="0"/>
+              <w:jc w:val="center"/>
             </w:pPr>
             <w:r>
               <w:rPr>
                 <w:rFonts w:ascii="Times New Roman" w:hAnsi="Times New Roman" w:cs="Times New Roman" w:eastAsia="Times New Roman"/>
-                <w:spacing w:val="-5"/>
-                <w:sz w:val="28"/>
+                <w:b w:val="0"/>
+                <w:sz w:val="24"/>
               </w:rPr>
               <w:t>8.</w:t>
             </w:r>
@@ -5326,98 +5064,67 @@
         </w:tc>
         <w:tc>
           <w:tcPr>
-            <w:tcW w:w="7264" w:type="dxa"/>
+            <w:tcW w:type="dxa" w:w="5645"/>
+            <w:vAlign w:val="top"/>
           </w:tcPr>
           <w:p>
             <w:pPr>
-              <w:pStyle w:val="TableParagraph"/>
-              <w:spacing w:before="98"/>
-              <w:rPr>
-                <w:sz w:val="28"/>
-              </w:rPr>
-            </w:pPr>
-          </w:p>
-          <w:p>
-            <w:pPr>
-              <w:pStyle w:val="TableParagraph"/>
-              <w:ind w:left="122"/>
-              <w:rPr>
-                <w:rFonts w:ascii="Times New Roman" w:hAnsi="Times New Roman" w:cs="Times New Roman" w:eastAsia="Times New Roman"/>
-                <w:sz w:val="28"/>
-              </w:rPr>
+              <w:spacing w:before="40" w:after="40"/>
+              <w:ind w:firstLine="0" w:left="0" w:right="0"/>
+              <w:jc w:val="center"/>
             </w:pPr>
             <w:r>
               <w:rPr>
                 <w:rFonts w:ascii="Times New Roman" w:hAnsi="Times New Roman" w:cs="Times New Roman" w:eastAsia="Times New Roman"/>
-                <w:sz w:val="28"/>
+                <w:b w:val="0"/>
+                <w:sz w:val="24"/>
               </w:rPr>
-              <w:t>Advantages</w:t>
+              <w:t>Advantages and Disadvantages</w:t>
             </w:r>
+          </w:p>
+        </w:tc>
+        <w:tc>
+          <w:tcPr>
+            <w:tcW w:type="dxa" w:w="1872"/>
+            <w:vAlign w:val="top"/>
+          </w:tcPr>
+          <w:p>
+            <w:pPr>
+              <w:spacing w:before="40" w:after="40"/>
+              <w:ind w:firstLine="0" w:left="0" w:right="0"/>
+              <w:jc w:val="center"/>
+            </w:pPr>
             <w:r>
               <w:rPr>
                 <w:rFonts w:ascii="Times New Roman" w:hAnsi="Times New Roman" w:cs="Times New Roman" w:eastAsia="Times New Roman"/>
-                <w:spacing w:val="-8"/>
-                <w:sz w:val="28"/>
+                <w:b w:val="0"/>
+                <w:sz w:val="24"/>
               </w:rPr>
-              <w:t xml:space="preserve"> </w:t>
-            </w:r>
-            <w:r>
-              <w:rPr>
-                <w:rFonts w:ascii="Times New Roman" w:hAnsi="Times New Roman" w:cs="Times New Roman" w:eastAsia="Times New Roman"/>
-                <w:sz w:val="28"/>
-              </w:rPr>
-              <w:t>and</w:t>
-            </w:r>
-            <w:r>
-              <w:rPr>
-                <w:rFonts w:ascii="Times New Roman" w:hAnsi="Times New Roman" w:cs="Times New Roman" w:eastAsia="Times New Roman"/>
-                <w:spacing w:val="-7"/>
-                <w:sz w:val="28"/>
-              </w:rPr>
-              <w:t xml:space="preserve"> </w:t>
-            </w:r>
-            <w:r>
-              <w:rPr>
-                <w:rFonts w:ascii="Times New Roman" w:hAnsi="Times New Roman" w:cs="Times New Roman" w:eastAsia="Times New Roman"/>
-                <w:spacing w:val="-2"/>
-                <w:sz w:val="28"/>
-              </w:rPr>
-              <w:t>Disadvantages</w:t>
+              <w:t>30</w:t>
             </w:r>
           </w:p>
         </w:tc>
       </w:tr>
       <w:tr>
         <w:trPr>
-          <w:trHeight w:val="865"/>
+          <w:trHeight w:val="806"/>
         </w:trPr>
         <w:tc>
           <w:tcPr>
-            <w:tcW w:w="674" w:type="dxa"/>
+            <w:tcW w:type="dxa" w:w="1843"/>
+            <w:vAlign w:val="top"/>
           </w:tcPr>
           <w:p>
             <w:pPr>
-              <w:pStyle w:val="TableParagraph"/>
-              <w:spacing w:before="98"/>
-              <w:rPr>
-                <w:sz w:val="28"/>
-              </w:rPr>
-            </w:pPr>
-          </w:p>
-          <w:p>
-            <w:pPr>
-              <w:pStyle w:val="TableParagraph"/>
-              <w:ind w:left="122"/>
-              <w:rPr>
-                <w:rFonts w:ascii="Times New Roman" w:hAnsi="Times New Roman" w:cs="Times New Roman" w:eastAsia="Times New Roman"/>
-                <w:sz w:val="28"/>
-              </w:rPr>
+              <w:spacing w:before="40" w:after="40"/>
+              <w:ind w:firstLine="0" w:left="0" w:right="0"/>
+              <w:jc w:val="center"/>
             </w:pPr>
             <w:r>
               <w:rPr>
                 <w:rFonts w:ascii="Times New Roman" w:hAnsi="Times New Roman" w:cs="Times New Roman" w:eastAsia="Times New Roman"/>
-                <w:spacing w:val="-5"/>
-                <w:sz w:val="28"/>
+                <w:b w:val="0"/>
+                <w:sz w:val="24"/>
               </w:rPr>
               <w:t>9.</w:t>
             </w:r>
@@ -5425,83 +5132,67 @@
         </w:tc>
         <w:tc>
           <w:tcPr>
-            <w:tcW w:w="7264" w:type="dxa"/>
+            <w:tcW w:type="dxa" w:w="5645"/>
+            <w:vAlign w:val="top"/>
           </w:tcPr>
           <w:p>
             <w:pPr>
-              <w:pStyle w:val="TableParagraph"/>
-              <w:spacing w:before="98"/>
-              <w:rPr>
-                <w:sz w:val="28"/>
-              </w:rPr>
-            </w:pPr>
-          </w:p>
-          <w:p>
-            <w:pPr>
-              <w:pStyle w:val="TableParagraph"/>
-              <w:ind w:left="122"/>
-              <w:rPr>
-                <w:rFonts w:ascii="Times New Roman" w:hAnsi="Times New Roman" w:cs="Times New Roman" w:eastAsia="Times New Roman"/>
-                <w:sz w:val="28"/>
-              </w:rPr>
+              <w:spacing w:before="40" w:after="40"/>
+              <w:ind w:firstLine="0" w:left="0" w:right="0"/>
+              <w:jc w:val="center"/>
             </w:pPr>
             <w:r>
               <w:rPr>
                 <w:rFonts w:ascii="Times New Roman" w:hAnsi="Times New Roman" w:cs="Times New Roman" w:eastAsia="Times New Roman"/>
-                <w:sz w:val="28"/>
+                <w:b w:val="0"/>
+                <w:sz w:val="24"/>
               </w:rPr>
-              <w:t>Challenges</w:t>
+              <w:t>Challenges Faced</w:t>
             </w:r>
+          </w:p>
+        </w:tc>
+        <w:tc>
+          <w:tcPr>
+            <w:tcW w:type="dxa" w:w="1872"/>
+            <w:vAlign w:val="top"/>
+          </w:tcPr>
+          <w:p>
+            <w:pPr>
+              <w:spacing w:before="40" w:after="40"/>
+              <w:ind w:firstLine="0" w:left="0" w:right="0"/>
+              <w:jc w:val="center"/>
+            </w:pPr>
             <w:r>
               <w:rPr>
                 <w:rFonts w:ascii="Times New Roman" w:hAnsi="Times New Roman" w:cs="Times New Roman" w:eastAsia="Times New Roman"/>
-                <w:spacing w:val="-10"/>
-                <w:sz w:val="28"/>
+                <w:b w:val="0"/>
+                <w:sz w:val="24"/>
               </w:rPr>
-              <w:t xml:space="preserve"> </w:t>
-            </w:r>
-            <w:r>
-              <w:rPr>
-                <w:rFonts w:ascii="Times New Roman" w:hAnsi="Times New Roman" w:cs="Times New Roman" w:eastAsia="Times New Roman"/>
-                <w:spacing w:val="-4"/>
-                <w:sz w:val="28"/>
-              </w:rPr>
-              <w:t>Faced</w:t>
+              <w:t>31</w:t>
             </w:r>
           </w:p>
         </w:tc>
       </w:tr>
       <w:tr>
         <w:trPr>
-          <w:trHeight w:val="863"/>
+          <w:trHeight w:val="806"/>
         </w:trPr>
         <w:tc>
           <w:tcPr>
-            <w:tcW w:w="674" w:type="dxa"/>
+            <w:tcW w:type="dxa" w:w="1843"/>
+            <w:vAlign w:val="top"/>
           </w:tcPr>
           <w:p>
             <w:pPr>
-              <w:pStyle w:val="TableParagraph"/>
-              <w:spacing w:before="95"/>
-              <w:rPr>
-                <w:sz w:val="28"/>
-              </w:rPr>
-            </w:pPr>
-          </w:p>
-          <w:p>
-            <w:pPr>
-              <w:pStyle w:val="TableParagraph"/>
-              <w:ind w:left="122"/>
-              <w:rPr>
-                <w:rFonts w:ascii="Times New Roman" w:hAnsi="Times New Roman" w:cs="Times New Roman" w:eastAsia="Times New Roman"/>
-                <w:sz w:val="28"/>
-              </w:rPr>
+              <w:spacing w:before="40" w:after="40"/>
+              <w:ind w:firstLine="0" w:left="0" w:right="0"/>
+              <w:jc w:val="center"/>
             </w:pPr>
             <w:r>
               <w:rPr>
                 <w:rFonts w:ascii="Times New Roman" w:hAnsi="Times New Roman" w:cs="Times New Roman" w:eastAsia="Times New Roman"/>
-                <w:spacing w:val="-5"/>
-                <w:sz w:val="28"/>
+                <w:b w:val="0"/>
+                <w:sz w:val="24"/>
               </w:rPr>
               <w:t>10.</w:t>
             </w:r>
@@ -5509,68 +5200,67 @@
         </w:tc>
         <w:tc>
           <w:tcPr>
-            <w:tcW w:w="7264" w:type="dxa"/>
+            <w:tcW w:type="dxa" w:w="5645"/>
+            <w:vAlign w:val="top"/>
           </w:tcPr>
           <w:p>
             <w:pPr>
-              <w:pStyle w:val="TableParagraph"/>
-              <w:spacing w:before="95"/>
-              <w:rPr>
-                <w:sz w:val="28"/>
-              </w:rPr>
-            </w:pPr>
-          </w:p>
-          <w:p>
-            <w:pPr>
-              <w:pStyle w:val="TableParagraph"/>
-              <w:ind w:left="122"/>
-              <w:rPr>
-                <w:rFonts w:ascii="Times New Roman" w:hAnsi="Times New Roman" w:cs="Times New Roman" w:eastAsia="Times New Roman"/>
-                <w:sz w:val="28"/>
-              </w:rPr>
+              <w:spacing w:before="40" w:after="40"/>
+              <w:ind w:firstLine="0" w:left="0" w:right="0"/>
+              <w:jc w:val="center"/>
             </w:pPr>
             <w:r>
               <w:rPr>
                 <w:rFonts w:ascii="Times New Roman" w:hAnsi="Times New Roman" w:cs="Times New Roman" w:eastAsia="Times New Roman"/>
-                <w:spacing w:val="-2"/>
-                <w:sz w:val="28"/>
+                <w:b w:val="0"/>
+                <w:sz w:val="24"/>
               </w:rPr>
               <w:t>Conclusion</w:t>
+            </w:r>
+          </w:p>
+        </w:tc>
+        <w:tc>
+          <w:tcPr>
+            <w:tcW w:type="dxa" w:w="1872"/>
+            <w:vAlign w:val="top"/>
+          </w:tcPr>
+          <w:p>
+            <w:pPr>
+              <w:spacing w:before="40" w:after="40"/>
+              <w:ind w:firstLine="0" w:left="0" w:right="0"/>
+              <w:jc w:val="center"/>
+            </w:pPr>
+            <w:r>
+              <w:rPr>
+                <w:rFonts w:ascii="Times New Roman" w:hAnsi="Times New Roman" w:cs="Times New Roman" w:eastAsia="Times New Roman"/>
+                <w:b w:val="0"/>
+                <w:sz w:val="24"/>
+              </w:rPr>
+              <w:t>32</w:t>
             </w:r>
           </w:p>
         </w:tc>
       </w:tr>
       <w:tr>
         <w:trPr>
-          <w:trHeight w:val="868"/>
+          <w:trHeight w:val="806"/>
         </w:trPr>
         <w:tc>
           <w:tcPr>
-            <w:tcW w:w="674" w:type="dxa"/>
+            <w:tcW w:type="dxa" w:w="1843"/>
+            <w:vAlign w:val="top"/>
           </w:tcPr>
           <w:p>
             <w:pPr>
-              <w:pStyle w:val="TableParagraph"/>
-              <w:spacing w:before="101"/>
-              <w:rPr>
-                <w:sz w:val="28"/>
-              </w:rPr>
-            </w:pPr>
-          </w:p>
-          <w:p>
-            <w:pPr>
-              <w:pStyle w:val="TableParagraph"/>
-              <w:ind w:left="122"/>
-              <w:rPr>
-                <w:rFonts w:ascii="Times New Roman" w:hAnsi="Times New Roman" w:cs="Times New Roman" w:eastAsia="Times New Roman"/>
-                <w:sz w:val="28"/>
-              </w:rPr>
+              <w:spacing w:before="40" w:after="40"/>
+              <w:ind w:firstLine="0" w:left="0" w:right="0"/>
+              <w:jc w:val="center"/>
             </w:pPr>
             <w:r>
               <w:rPr>
                 <w:rFonts w:ascii="Times New Roman" w:hAnsi="Times New Roman" w:cs="Times New Roman" w:eastAsia="Times New Roman"/>
-                <w:spacing w:val="-5"/>
-                <w:sz w:val="28"/>
+                <w:b w:val="0"/>
+                <w:sz w:val="24"/>
               </w:rPr>
               <w:t>11.</w:t>
             </w:r>
@@ -5578,33 +5268,43 @@
         </w:tc>
         <w:tc>
           <w:tcPr>
-            <w:tcW w:w="7264" w:type="dxa"/>
+            <w:tcW w:type="dxa" w:w="5645"/>
+            <w:vAlign w:val="top"/>
           </w:tcPr>
           <w:p>
             <w:pPr>
-              <w:pStyle w:val="TableParagraph"/>
-              <w:spacing w:before="101"/>
-              <w:rPr>
-                <w:sz w:val="28"/>
-              </w:rPr>
-            </w:pPr>
-          </w:p>
-          <w:p>
-            <w:pPr>
-              <w:pStyle w:val="TableParagraph"/>
-              <w:ind w:left="122"/>
-              <w:rPr>
-                <w:rFonts w:ascii="Times New Roman" w:hAnsi="Times New Roman" w:cs="Times New Roman" w:eastAsia="Times New Roman"/>
-                <w:sz w:val="28"/>
-              </w:rPr>
+              <w:spacing w:before="40" w:after="40"/>
+              <w:ind w:firstLine="0" w:left="0" w:right="0"/>
+              <w:jc w:val="center"/>
             </w:pPr>
             <w:r>
               <w:rPr>
                 <w:rFonts w:ascii="Times New Roman" w:hAnsi="Times New Roman" w:cs="Times New Roman" w:eastAsia="Times New Roman"/>
-                <w:spacing w:val="-2"/>
-                <w:sz w:val="28"/>
+                <w:b w:val="0"/>
+                <w:sz w:val="24"/>
               </w:rPr>
               <w:t>Reference</w:t>
+            </w:r>
+          </w:p>
+        </w:tc>
+        <w:tc>
+          <w:tcPr>
+            <w:tcW w:type="dxa" w:w="1872"/>
+            <w:vAlign w:val="top"/>
+          </w:tcPr>
+          <w:p>
+            <w:pPr>
+              <w:spacing w:before="40" w:after="40"/>
+              <w:ind w:firstLine="0" w:left="0" w:right="0"/>
+              <w:jc w:val="center"/>
+            </w:pPr>
+            <w:r>
+              <w:rPr>
+                <w:rFonts w:ascii="Times New Roman" w:hAnsi="Times New Roman" w:cs="Times New Roman" w:eastAsia="Times New Roman"/>
+                <w:b w:val="0"/>
+                <w:sz w:val="24"/>
+              </w:rPr>
+              <w:t>32</w:t>
             </w:r>
           </w:p>
         </w:tc>
@@ -6836,6 +6536,7 @@
           <w:sz w:val="24"/>
         </w:rPr>
         <w:sectPr>
+          <w:footerReference w:type="default" r:id="rId18"/>
           <w:pgSz w:w="12240" w:h="15840"/>
           <w:pgMar w:top="1380" w:right="1080" w:bottom="280" w:left="1080" w:header="720" w:footer="720" w:gutter="0"/>
           <w:pgBorders w:offsetFrom="page">
@@ -6844,6 +6545,7 @@
             <w:bottom w:val="single" w:sz="12" w:space="24" w:color="000000"/>
             <w:right w:val="single" w:sz="12" w:space="24" w:color="000000"/>
           </w:pgBorders>
+          <w:pgNumType w:start="1"/>
           <w:cols w:space="720"/>
         </w:sectPr>
       </w:pPr>
@@ -35254,6 +34956,27 @@
     </w:sectPr>
   </w:body>
 </w:document>
+</file>
+
+<file path=word/footer1.xml><?xml version="1.0" encoding="utf-8"?>
+<w:ftr xmlns:m="http://schemas.openxmlformats.org/officeDocument/2006/math" xmlns:mc="http://schemas.openxmlformats.org/markup-compatibility/2006" xmlns:mo="http://schemas.microsoft.com/office/mac/office/2008/main" xmlns:mv="urn:schemas-microsoft-com:mac:vml" xmlns:o="urn:schemas-microsoft-com:office:office" xmlns:r="http://schemas.openxmlformats.org/officeDocument/2006/relationships" xmlns:v="urn:schemas-microsoft-com:vml" xmlns:w10="urn:schemas-microsoft-com:office:word" xmlns:w14="http://schemas.microsoft.com/office/word/2010/wordml" xmlns:w="http://schemas.openxmlformats.org/wordprocessingml/2006/main" xmlns:wne="http://schemas.microsoft.com/office/word/2006/wordml" xmlns:wp14="http://schemas.microsoft.com/office/word/2010/wordprocessingDrawing" xmlns:wp="http://schemas.openxmlformats.org/drawingml/2006/wordprocessingDrawing" xmlns:wpc="http://schemas.microsoft.com/office/word/2010/wordprocessingCanvas" xmlns:wpg="http://schemas.microsoft.com/office/word/2010/wordprocessingGroup" xmlns:wpi="http://schemas.microsoft.com/office/word/2010/wordprocessingInk" xmlns:wps="http://schemas.microsoft.com/office/word/2010/wordprocessingShape" mc:Ignorable="w14 wp14">
+  <w:p>
+    <w:pPr>
+      <w:pStyle w:val="Footer"/>
+      <w:jc w:val="left"/>
+    </w:pPr>
+    <w:r>
+      <w:rPr>
+        <w:rFonts w:ascii="Calibri" w:hAnsi="Calibri" w:cs="Calibri" w:eastAsia="Calibri"/>
+        <w:b w:val="0"/>
+        <w:sz w:val="22"/>
+      </w:rPr>
+      <w:fldChar w:fldCharType="begin"/>
+      <w:instrText xml:space="preserve">PAGE</w:instrText>
+      <w:fldChar w:fldCharType="end"/>
+    </w:r>
+  </w:p>
+</w:ftr>
 </file>
 
 <file path=word/numbering.xml><?xml version="1.0" encoding="utf-8"?>

</xml_diff>